<commit_message>
Correct the legal entity name to OÜ Küberloome across public copy and agreements
Preserve registry code 14206225, agreement acknowledgements and historical signed files. Verify the active locale documents and exact name-only text/OOXML changes, including two Estonian case adjustments. Review Word-rendered agreement pages in all three languages.
</commit_message>
<xml_diff>
--- a/public/legal/sotsiaal-pro-framework-en-2026-10-03.docx
+++ b/public/legal/sotsiaal-pro-framework-en-2026-10-03.docx
@@ -166,18 +166,18 @@
         <w:rPr>
           <w:sz w:val="22"/>
         </w:rPr>
-        <w:t xml:space="preserve">1.1. This framework agreement establishes the principles for the professional use of the Sotsiaal.pro platform and the obligations of the organisation and Küberloome OÜ in the processing of personal data.</w:t>
-      </w:r>
-    </w:p>
-    <w:p>
-      <w:pPr>
-        <w:spacing w:after="140"/>
-      </w:pPr>
-      <w:r>
-        <w:rPr>
-          <w:sz w:val="22"/>
-        </w:rPr>
-        <w:t xml:space="preserve">1.2. The parties to the agreement are the organisation or local government and Küberloome OÜ.</w:t>
+        <w:t xml:space="preserve">1.1. This framework agreement establishes the principles for the professional use of the Sotsiaal.pro platform and the obligations of the organisation and OÜ Küberloome in the processing of personal data.</w:t>
+      </w:r>
+    </w:p>
+    <w:p>
+      <w:pPr>
+        <w:spacing w:after="140"/>
+      </w:pPr>
+      <w:r>
+        <w:rPr>
+          <w:sz w:val="22"/>
+        </w:rPr>
+        <w:t xml:space="preserve">1.2. The parties to the agreement are the organisation or local government and OÜ Küberloome.</w:t>
       </w:r>
     </w:p>
     <w:p>
@@ -199,7 +199,7 @@
         <w:rPr>
           <w:sz w:val="22"/>
         </w:rPr>
-        <w:t xml:space="preserve">1.4. This agreement also constitutes a data processing agreement to the extent that Küberloome OÜ processes personal data on behalf of the organisation.</w:t>
+        <w:t xml:space="preserve">1.4. This agreement also constitutes a data processing agreement to the extent that OÜ Küberloome processes personal data on behalf of the organisation.</w:t>
       </w:r>
     </w:p>
     <w:p>
@@ -311,7 +311,7 @@
         <w:rPr>
           <w:sz w:val="22"/>
         </w:rPr>
-        <w:t xml:space="preserve">3.2. Küberloome OÜ is the processor to the extent that it processes the organisation's work data on behalf of the organisation and on the basis of the organisation's documented instructions.</w:t>
+        <w:t xml:space="preserve">3.2. OÜ Küberloome is the processor to the extent that it processes the organisation's work data on behalf of the organisation and on the basis of the organisation's documented instructions.</w:t>
       </w:r>
     </w:p>
     <w:p>
@@ -333,7 +333,7 @@
         <w:rPr>
           <w:sz w:val="22"/>
         </w:rPr>
-        <w:t xml:space="preserve">3.4. Küberloome OÜ may be a separate controller with respect to data that it processes for the administration of its own service, for example for managing user accounts, billing, ensuring security, performing the agreement or fulfilling statutory obligations. Such processing is described in the Sotsiaal.pro privacy terms.</w:t>
+        <w:t xml:space="preserve">3.4. OÜ Küberloome may be a separate controller with respect to data that it processes for the administration of its own service, for example for managing user accounts, billing, ensuring security, performing the agreement or fulfilling statutory obligations. Such processing is described in the Sotsiaal.pro privacy terms.</w:t>
       </w:r>
     </w:p>
     <w:p>
@@ -567,18 +567,18 @@
         <w:rPr>
           <w:sz w:val="22"/>
         </w:rPr>
-        <w:t xml:space="preserve">6.1. This clause constitutes the data processing agreement between the organisation and Küberloome OÜ to the extent that Küberloome OÜ processes personal data on behalf of the organisation.</w:t>
-      </w:r>
-    </w:p>
-    <w:p>
-      <w:pPr>
-        <w:spacing w:after="140"/>
-      </w:pPr>
-      <w:r>
-        <w:rPr>
-          <w:sz w:val="22"/>
-        </w:rPr>
-        <w:t xml:space="preserve">6.2. Küberloome OÜ processes the organisation's work data only on the basis of the organisation's documented instructions and to the extent necessary for providing the service.</w:t>
+        <w:t xml:space="preserve">6.1. This clause constitutes the data processing agreement between the organisation and OÜ Küberloome to the extent that OÜ Küberloome processes personal data on behalf of the organisation.</w:t>
+      </w:r>
+    </w:p>
+    <w:p>
+      <w:pPr>
+        <w:spacing w:after="140"/>
+      </w:pPr>
+      <w:r>
+        <w:rPr>
+          <w:sz w:val="22"/>
+        </w:rPr>
+        <w:t xml:space="preserve">6.2. OÜ Küberloome processes the organisation's work data only on the basis of the organisation's documented instructions and to the extent necessary for providing the service.</w:t>
       </w:r>
     </w:p>
     <w:p>
@@ -600,40 +600,40 @@
         <w:rPr>
           <w:sz w:val="22"/>
         </w:rPr>
-        <w:t xml:space="preserve">6.4. Küberloome OÜ ensures that persons who come into contact with the organisation's data are bound by a confidentiality obligation or are subject to a statutory confidentiality obligation.</w:t>
-      </w:r>
-    </w:p>
-    <w:p>
-      <w:pPr>
-        <w:spacing w:after="140"/>
-      </w:pPr>
-      <w:r>
-        <w:rPr>
-          <w:sz w:val="22"/>
-        </w:rPr>
-        <w:t xml:space="preserve">6.5. Küberloome OÜ implements appropriate technical and organisational measures to protect the organisation's data, taking into account the nature, scope, context and purposes of the processing and the risk to the rights and freedoms of data subjects. A summary of the measures is provided in Annex 4.</w:t>
-      </w:r>
-    </w:p>
-    <w:p>
-      <w:pPr>
-        <w:spacing w:after="140"/>
-      </w:pPr>
-      <w:r>
-        <w:rPr>
-          <w:sz w:val="22"/>
-        </w:rPr>
-        <w:t xml:space="preserve">6.6. If Küberloome OÜ considers that an instruction of the organisation may be contrary to applicable data protection law, it will inform the organisation thereof within a reasonable time, unless such notification is prohibited by law.</w:t>
-      </w:r>
-    </w:p>
-    <w:p>
-      <w:pPr>
-        <w:spacing w:after="140"/>
-      </w:pPr>
-      <w:r>
-        <w:rPr>
-          <w:sz w:val="22"/>
-        </w:rPr>
-        <w:t xml:space="preserve">6.7. Küberloome OÜ does not use the organisation's work data for any purpose other than providing the service, performing the agreement or another purpose permitted under this agreement, the privacy terms or a basis agreed between the parties.</w:t>
+        <w:t xml:space="preserve">6.4. OÜ Küberloome ensures that persons who come into contact with the organisation's data are bound by a confidentiality obligation or are subject to a statutory confidentiality obligation.</w:t>
+      </w:r>
+    </w:p>
+    <w:p>
+      <w:pPr>
+        <w:spacing w:after="140"/>
+      </w:pPr>
+      <w:r>
+        <w:rPr>
+          <w:sz w:val="22"/>
+        </w:rPr>
+        <w:t xml:space="preserve">6.5. OÜ Küberloome implements appropriate technical and organisational measures to protect the organisation's data, taking into account the nature, scope, context and purposes of the processing and the risk to the rights and freedoms of data subjects. A summary of the measures is provided in Annex 4.</w:t>
+      </w:r>
+    </w:p>
+    <w:p>
+      <w:pPr>
+        <w:spacing w:after="140"/>
+      </w:pPr>
+      <w:r>
+        <w:rPr>
+          <w:sz w:val="22"/>
+        </w:rPr>
+        <w:t xml:space="preserve">6.6. If OÜ Küberloome considers that an instruction of the organisation may be contrary to applicable data protection law, it will inform the organisation thereof within a reasonable time, unless such notification is prohibited by law.</w:t>
+      </w:r>
+    </w:p>
+    <w:p>
+      <w:pPr>
+        <w:spacing w:after="140"/>
+      </w:pPr>
+      <w:r>
+        <w:rPr>
+          <w:sz w:val="22"/>
+        </w:rPr>
+        <w:t xml:space="preserve">6.7. OÜ Küberloome does not use the organisation's work data for any purpose other than providing the service, performing the agreement or another purpose permitted under this agreement, the privacy terms or a basis agreed between the parties.</w:t>
       </w:r>
     </w:p>
     <w:p>
@@ -744,18 +744,18 @@
         <w:rPr>
           <w:sz w:val="22"/>
         </w:rPr>
-        <w:t xml:space="preserve">7.4. Küberloome OÜ ensures that appropriate confidentiality, security and data protection obligations, and where necessary data transfer safeguards, apply to the artificial intelligence service provider.</w:t>
-      </w:r>
-    </w:p>
-    <w:p>
-      <w:pPr>
-        <w:spacing w:after="140"/>
-      </w:pPr>
-      <w:r>
-        <w:rPr>
-          <w:sz w:val="22"/>
-        </w:rPr>
-        <w:t xml:space="preserve">7.5. If the organisation requires more detailed information about a specific artificial intelligence service provider, data transfer or sub-processor, Küberloome OÜ will make it available to a reasonable extent through an annex to the agreement, the website or a written enquiry.</w:t>
+        <w:t xml:space="preserve">7.4. OÜ Küberloome ensures that appropriate confidentiality, security and data protection obligations, and where necessary data transfer safeguards, apply to the artificial intelligence service provider.</w:t>
+      </w:r>
+    </w:p>
+    <w:p>
+      <w:pPr>
+        <w:spacing w:after="140"/>
+      </w:pPr>
+      <w:r>
+        <w:rPr>
+          <w:sz w:val="22"/>
+        </w:rPr>
+        <w:t xml:space="preserve">7.5. If the organisation requires more detailed information about a specific artificial intelligence service provider, data transfer or sub-processor, OÜ Küberloome will make it available to a reasonable extent through an annex to the agreement, the website or a written enquiry.</w:t>
       </w:r>
     </w:p>
     <w:p>
@@ -800,7 +800,7 @@
         <w:rPr>
           <w:sz w:val="22"/>
         </w:rPr>
-        <w:t xml:space="preserve">8.3. For administering the service, ensuring security, providing technical support, investigating an error or security incident, preventing misuse or fulfilling a legal obligation, Küberloome OÜ may process limited technical metadata or carry out justified data operations only to the extent necessary.</w:t>
+        <w:t xml:space="preserve">8.3. For administering the service, ensuring security, providing technical support, investigating an error or security incident, preventing misuse or fulfilling a legal obligation, OÜ Küberloome may process limited technical metadata or carry out justified data operations only to the extent necessary.</w:t>
       </w:r>
     </w:p>
     <w:p>
@@ -890,18 +890,18 @@
         <w:rPr>
           <w:sz w:val="22"/>
         </w:rPr>
-        <w:t xml:space="preserve">10.1. Küberloome OÜ may use necessary sub-processors and service providers for providing the service, for example providers of hosting, artificial intelligence, speech services, e-mail, logging, monitoring, authentication, backup or technical infrastructure services.</w:t>
-      </w:r>
-    </w:p>
-    <w:p>
-      <w:pPr>
-        <w:spacing w:after="140"/>
-      </w:pPr>
-      <w:r>
-        <w:rPr>
-          <w:sz w:val="22"/>
-        </w:rPr>
-        <w:t xml:space="preserve">10.2. The organisation grants Küberloome OÜ a general authorisation to use sub-processors necessary for providing the service.</w:t>
+        <w:t xml:space="preserve">10.1. OÜ Küberloome may use necessary sub-processors and service providers for providing the service, for example providers of hosting, artificial intelligence, speech services, e-mail, logging, monitoring, authentication, backup or technical infrastructure services.</w:t>
+      </w:r>
+    </w:p>
+    <w:p>
+      <w:pPr>
+        <w:spacing w:after="140"/>
+      </w:pPr>
+      <w:r>
+        <w:rPr>
+          <w:sz w:val="22"/>
+        </w:rPr>
+        <w:t xml:space="preserve">10.2. The organisation grants OÜ Küberloome a general authorisation to use sub-processors necessary for providing the service.</w:t>
       </w:r>
     </w:p>
     <w:p>
@@ -923,18 +923,18 @@
         <w:rPr>
           <w:sz w:val="22"/>
         </w:rPr>
-        <w:t xml:space="preserve">10.4. Küberloome OÜ ensures that sub-processors are, to the appropriate extent, subject to data protection obligations equivalent to those applying to Küberloome OÜ under this agreement.</w:t>
-      </w:r>
-    </w:p>
-    <w:p>
-      <w:pPr>
-        <w:spacing w:after="140"/>
-      </w:pPr>
-      <w:r>
-        <w:rPr>
-          <w:sz w:val="22"/>
-        </w:rPr>
-        <w:t xml:space="preserve">10.5. If Küberloome OÜ adds a new significant sub-processor or replaces an existing significant sub-processor, it will inform the organisation thereof within a reasonable time. The organisation has the right to raise a justified objection.</w:t>
+        <w:t xml:space="preserve">10.4. OÜ Küberloome ensures that sub-processors are, to the appropriate extent, subject to data protection obligations equivalent to those applying to OÜ Küberloome under this agreement.</w:t>
+      </w:r>
+    </w:p>
+    <w:p>
+      <w:pPr>
+        <w:spacing w:after="140"/>
+      </w:pPr>
+      <w:r>
+        <w:rPr>
+          <w:sz w:val="22"/>
+        </w:rPr>
+        <w:t xml:space="preserve">10.5. If OÜ Küberloome adds a new significant sub-processor or replaces an existing significant sub-processor, it will inform the organisation thereof within a reasonable time. The organisation has the right to raise a justified objection.</w:t>
       </w:r>
     </w:p>
     <w:p>
@@ -956,7 +956,7 @@
         <w:rPr>
           <w:sz w:val="22"/>
         </w:rPr>
-        <w:t xml:space="preserve">10.7. If the provision of the service requires the transfer of personal data outside the European Union or the European Economic Area, Küberloome OÜ does so only on the basis of applicable law and uses appropriate safeguards.</w:t>
+        <w:t xml:space="preserve">10.7. If the provision of the service requires the transfer of personal data outside the European Union or the European Economic Area, OÜ Küberloome does so only on the basis of applicable law and uses appropriate safeguards.</w:t>
       </w:r>
     </w:p>
     <w:p>
@@ -1001,7 +1001,7 @@
         <w:rPr>
           <w:sz w:val="22"/>
         </w:rPr>
-        <w:t xml:space="preserve">11.2. Küberloome OÜ assists the organisation to a reasonable extent in resolving data subjects' requests, assessing breaches, preparing impact assessments and fulfilling other data protection obligations to the extent that this relates to the Sotsiaal.pro service.</w:t>
+        <w:t xml:space="preserve">11.2. OÜ Küberloome assists the organisation to a reasonable extent in resolving data subjects' requests, assessing breaches, preparing impact assessments and fulfilling other data protection obligations to the extent that this relates to the Sotsiaal.pro service.</w:t>
       </w:r>
     </w:p>
     <w:p>
@@ -1023,29 +1023,29 @@
         <w:rPr>
           <w:sz w:val="22"/>
         </w:rPr>
-        <w:t xml:space="preserve">11.4. If Küberloome OÜ becomes aware of a personal data breach affecting the organisation's data, it will notify the organisation without undue delay and, where possible, within 24 hours of becoming aware of the breach.</w:t>
-      </w:r>
-    </w:p>
-    <w:p>
-      <w:pPr>
-        <w:spacing w:after="140"/>
-      </w:pPr>
-      <w:r>
-        <w:rPr>
-          <w:sz w:val="22"/>
-        </w:rPr>
-        <w:t xml:space="preserve">11.5. The notification includes the initially known information about the nature of the breach, the data affected, the possible impact, the measures taken or planned and the contact point. If all the information is not initially available, Küberloome OÜ may provide the information in stages.</w:t>
-      </w:r>
-    </w:p>
-    <w:p>
-      <w:pPr>
-        <w:spacing w:after="140"/>
-      </w:pPr>
-      <w:r>
-        <w:rPr>
-          <w:sz w:val="22"/>
-        </w:rPr>
-        <w:t xml:space="preserve">11.6. Küberloome OÜ makes available to the organisation, to a reasonable extent, the information necessary to demonstrate compliance with this data processing agreement.</w:t>
+        <w:t xml:space="preserve">11.4. If OÜ Küberloome becomes aware of a personal data breach affecting the organisation's data, it will notify the organisation without undue delay and, where possible, within 24 hours of becoming aware of the breach.</w:t>
+      </w:r>
+    </w:p>
+    <w:p>
+      <w:pPr>
+        <w:spacing w:after="140"/>
+      </w:pPr>
+      <w:r>
+        <w:rPr>
+          <w:sz w:val="22"/>
+        </w:rPr>
+        <w:t xml:space="preserve">11.5. The notification includes the initially known information about the nature of the breach, the data affected, the possible impact, the measures taken or planned and the contact point. If all the information is not initially available, OÜ Küberloome may provide the information in stages.</w:t>
+      </w:r>
+    </w:p>
+    <w:p>
+      <w:pPr>
+        <w:spacing w:after="140"/>
+      </w:pPr>
+      <w:r>
+        <w:rPr>
+          <w:sz w:val="22"/>
+        </w:rPr>
+        <w:t xml:space="preserve">11.6. OÜ Küberloome makes available to the organisation, to a reasonable extent, the information necessary to demonstrate compliance with this data processing agreement.</w:t>
       </w:r>
     </w:p>
     <w:p>
@@ -1179,7 +1179,7 @@
         <w:rPr>
           <w:sz w:val="22"/>
         </w:rPr>
-        <w:t xml:space="preserve">13.1. Upon termination of the use of the service, Küberloome OÜ deletes or returns the organisation's work data in accordance with the organisation's instructions, to the extent technically possible and consistent with applicable retention obligations.</w:t>
+        <w:t xml:space="preserve">13.1. Upon termination of the use of the service, OÜ Küberloome deletes or returns the organisation's work data in accordance with the organisation's instructions, to the extent technically possible and consistent with applicable retention obligations.</w:t>
       </w:r>
     </w:p>
     <w:p>
@@ -1235,7 +1235,7 @@
         <w:rPr>
           <w:sz w:val="22"/>
         </w:rPr>
-        <w:t xml:space="preserve">14.3. Küberloome OÜ is responsible for providing the service, following the organisation's documented instructions, implementing the agreed security measures and fulfilling the processor obligations described in this agreement.</w:t>
+        <w:t xml:space="preserve">14.3. OÜ Küberloome is responsible for providing the service, following the organisation's documented instructions, implementing the agreed security measures and fulfilling the processor obligations described in this agreement.</w:t>
       </w:r>
     </w:p>
     <w:p>
@@ -1281,7 +1281,7 @@
         <w:rPr>
           <w:sz w:val="22"/>
         </w:rPr>
-        <w:t xml:space="preserve">16.1. This agreement enters into force when the organisation and Küberloome OÜ have signed it or have otherwise confirmed its application in a format that can be reproduced in writing.</w:t>
+        <w:t xml:space="preserve">16.1. This agreement enters into force when the organisation and OÜ Küberloome have signed it or have otherwise confirmed its application in a format that can be reproduced in writing.</w:t>
       </w:r>
     </w:p>
     <w:p>
@@ -1391,7 +1391,7 @@
         <w:rPr>
           <w:sz w:val="22"/>
         </w:rPr>
-        <w:t xml:space="preserve">Küberloome OÜ</w:t>
+        <w:t xml:space="preserve">OÜ Küberloome</w:t>
       </w:r>
     </w:p>
     <w:p>
@@ -1601,7 +1601,7 @@
         <w:rPr>
           <w:sz w:val="22"/>
         </w:rPr>
-        <w:t xml:space="preserve">Küberloome OÜ.</w:t>
+        <w:t xml:space="preserve">OÜ Küberloome.</w:t>
       </w:r>
     </w:p>
     <w:p>

</xml_diff>